<commit_message>
stage 2 push 5 updated stage 1 doc again with correct c4
</commit_message>
<xml_diff>
--- a/com3810/docs/Stage 1 Functional Requirements Updated.docx
+++ b/com3810/docs/Stage 1 Functional Requirements Updated.docx
@@ -441,12 +441,12 @@
           <wp:inline distB="114300" distT="114300" distL="114300" distR="114300">
             <wp:extent cx="6263675" cy="5249275"/>
             <wp:effectExtent b="0" l="0" r="0" t="0"/>
-            <wp:docPr id="2" name="image1.png"/>
+            <wp:docPr id="1" name="image2.png"/>
             <a:graphic>
               <a:graphicData uri="http://schemas.openxmlformats.org/drawingml/2006/picture">
                 <pic:pic>
                   <pic:nvPicPr>
-                    <pic:cNvPr id="0" name="image1.png"/>
+                    <pic:cNvPr id="0" name="image2.png"/>
                     <pic:cNvPicPr preferRelativeResize="0"/>
                   </pic:nvPicPr>
                   <pic:blipFill>
@@ -2439,18 +2439,11 @@
     </w:p>
     <w:p>
       <w:pPr>
-        <w:rPr/>
-      </w:pPr>
-      <w:r>
-        <w:rPr>
-          <w:rtl w:val="0"/>
-        </w:rPr>
-      </w:r>
-    </w:p>
-    <w:p>
-      <w:pPr>
         <w:ind w:left="0" w:firstLine="0"/>
-        <w:rPr/>
+        <w:rPr>
+          <w:b w:val="1"/>
+          <w:bCs w:val="1"/>
+        </w:rPr>
       </w:pPr>
       <w:r>
         <w:rPr>
@@ -2466,18 +2459,30 @@
         </w:rPr>
         <w:t xml:space="preserve">Corrected C4 diagram</w:t>
       </w:r>
-      <w:r>
-        <w:rPr/>
+    </w:p>
+    <w:p>
+      <w:pPr>
+        <w:ind w:left="0" w:firstLine="0"/>
+        <w:rPr>
+          <w:b w:val="1"/>
+          <w:bCs w:val="1"/>
+        </w:rPr>
+      </w:pPr>
+      <w:r>
+        <w:rPr>
+          <w:b w:val="1"/>
+          <w:bCs w:val="1"/>
+        </w:rPr>
         <w:drawing>
           <wp:inline distB="114300" distT="114300" distL="114300" distR="114300">
-            <wp:extent cx="6057900" cy="3581400"/>
+            <wp:extent cx="5414963" cy="3652545"/>
             <wp:effectExtent b="0" l="0" r="0" t="0"/>
-            <wp:docPr id="1" name="image2.png"/>
+            <wp:docPr id="2" name="image1.png"/>
             <a:graphic>
               <a:graphicData uri="http://schemas.openxmlformats.org/drawingml/2006/picture">
                 <pic:pic>
                   <pic:nvPicPr>
-                    <pic:cNvPr id="0" name="image2.png"/>
+                    <pic:cNvPr id="0" name="image1.png"/>
                     <pic:cNvPicPr preferRelativeResize="0"/>
                   </pic:nvPicPr>
                   <pic:blipFill>
@@ -2490,7 +2495,7 @@
                   <pic:spPr>
                     <a:xfrm>
                       <a:off x="0" y="0"/>
-                      <a:ext cx="6057900" cy="3581400"/>
+                      <a:ext cx="5414963" cy="3652545"/>
                     </a:xfrm>
                     <a:prstGeom prst="rect"/>
                     <a:ln/>

</xml_diff>